<commit_message>
SEHHACA-218: interview: investment platform data engineer
</commit_message>
<xml_diff>
--- a/assets/doc/interview/investment_platform_data_engineer_technical_interview_prep.docx
+++ b/assets/doc/interview/investment_platform_data_engineer_technical_interview_prep.docx
@@ -11868,10 +11868,30 @@
     </w:p>
     <w:p>
       <w:pPr>
+        <w:spacing w:after="200" w:line="276" w:lineRule="auto"/>
+        <w:rPr>
+          <w:rFonts w:asciiTheme="majorHAnsi" w:eastAsiaTheme="majorEastAsia" w:hAnsiTheme="majorHAnsi" w:cstheme="majorBidi"/>
+          <w:b/>
+          <w:bCs/>
+          <w:color w:val="18365D"/>
+          <w:sz w:val="33"/>
+          <w:szCs w:val="28"/>
+        </w:rPr>
+      </w:pPr>
+      <w:r>
+        <w:br w:type="page"/>
+      </w:r>
+    </w:p>
+    <w:p>
+      <w:pPr>
         <w:pStyle w:val="Heading1"/>
       </w:pPr>
-      <w:r>
-        <w:lastRenderedPageBreak/>
+    </w:p>
+    <w:p>
+      <w:pPr>
+        <w:pStyle w:val="Heading1"/>
+      </w:pPr>
+      <w:r>
         <w:t>15. Most Likely System-Design Scenario: Enhance or Scale Bloomberg Processing on the Investment Platform</w:t>
       </w:r>
     </w:p>
@@ -12093,9 +12113,26 @@
     </w:p>
     <w:p>
       <w:pPr>
+        <w:spacing w:after="200" w:line="276" w:lineRule="auto"/>
+        <w:rPr>
+          <w:rFonts w:asciiTheme="majorHAnsi" w:eastAsiaTheme="majorEastAsia" w:hAnsiTheme="majorHAnsi" w:cstheme="majorBidi"/>
+          <w:b/>
+          <w:bCs/>
+          <w:color w:val="18365D"/>
+          <w:sz w:val="33"/>
+          <w:szCs w:val="28"/>
+        </w:rPr>
+      </w:pPr>
+      <w:r>
+        <w:br w:type="page"/>
+      </w:r>
+    </w:p>
+    <w:p>
+      <w:pPr>
         <w:pStyle w:val="Heading1"/>
       </w:pPr>
       <w:r>
+        <w:lastRenderedPageBreak/>
         <w:t>16. Investment Platform Maintenance / Upgrade - How to Approach an Existing Platform</w:t>
       </w:r>
     </w:p>
@@ -12333,7 +12370,6 @@
         <w:pStyle w:val="Heading1"/>
       </w:pPr>
       <w:r>
-        <w:lastRenderedPageBreak/>
         <w:t>17. Data Quality, Reconciliation and Observability</w:t>
       </w:r>
     </w:p>
@@ -13127,6 +13163,7 @@
         <w:rPr>
           <w:b/>
         </w:rPr>
+        <w:lastRenderedPageBreak/>
         <w:t xml:space="preserve">• </w:t>
       </w:r>
       <w:r>
@@ -13335,7 +13372,6 @@
         <w:pStyle w:val="Heading1"/>
       </w:pPr>
       <w:r>
-        <w:lastRenderedPageBreak/>
         <w:t>19. Python, SQL and Application Engineering - More Likely Than Before</w:t>
       </w:r>
     </w:p>
@@ -13692,6 +13728,7 @@
         <w:rPr>
           <w:b/>
         </w:rPr>
+        <w:lastRenderedPageBreak/>
         <w:t xml:space="preserve">• </w:t>
       </w:r>
       <w:r>
@@ -14104,7 +14141,6 @@
                 <w:color w:val="18365D"/>
                 <w:sz w:val="16"/>
               </w:rPr>
-              <w:lastRenderedPageBreak/>
               <w:t>SAFE ANSWER</w:t>
             </w:r>
           </w:p>
@@ -14421,6 +14457,7 @@
     </w:p>
     <w:p>
       <w:r>
+        <w:lastRenderedPageBreak/>
         <w:t>• Same-team signal - FCA-regulated context: engineering evidence should show controlled change, traceability and reliable data supporting good client outcomes; do not present yourself as the legal/compliance owner.</w:t>
       </w:r>
     </w:p>
@@ -15025,7 +15062,6 @@
         <w:rPr>
           <w:b/>
         </w:rPr>
-        <w:lastRenderedPageBreak/>
         <w:t xml:space="preserve">• </w:t>
       </w:r>
       <w:r>
@@ -15194,6 +15230,7 @@
         <w:pStyle w:val="Heading2"/>
       </w:pPr>
       <w:r>
+        <w:lastRenderedPageBreak/>
         <w:t>How would you rationalise tooling?</w:t>
       </w:r>
     </w:p>
@@ -20554,6 +20591,7 @@
                 <w:b/>
                 <w:sz w:val="14"/>
               </w:rPr>
+              <w:lastRenderedPageBreak/>
               <w:t>A scheduled job on a third-party platform fails before a risk cut-off. What do you do?</w:t>
             </w:r>
           </w:p>

</xml_diff>